<commit_message>
feat: regime L1 tuning + QC update + report integration + broker module scaffold
</commit_message>
<xml_diff>
--- a/docs/diagrams/Documentazione Sintetica Moduli – Py Suite Trading-3.docx
+++ b/docs/diagrams/Documentazione Sintetica Moduli – Py Suite Trading-3.docx
@@ -134,6 +134,7 @@
                                     <w:dataBinding w:prefixMappings="xmlns:ns0='http://purl.org/dc/elements/1.1/' xmlns:ns1='http://schemas.openxmlformats.org/package/2006/metadata/core-properties' " w:xpath="/ns1:coreProperties[1]/ns0:title[1]" w:storeItemID="{6C3C8BC8-F283-45AE-878A-BAB7291924A1}"/>
                                     <w:text/>
                                   </w:sdtPr>
+                                  <w:sdtEndPr/>
                                   <w:sdtContent>
                                     <w:proofErr w:type="spellStart"/>
                                     <w:r>
@@ -153,25 +154,7 @@
                                         <w:szCs w:val="72"/>
                                         <w:lang w:val="it-IT"/>
                                       </w:rPr>
-                                      <w:t xml:space="preserve"> – </w:t>
-                                    </w:r>
-                                    <w:r>
-                                      <w:rPr>
-                                        <w:color w:val="0F4761" w:themeColor="accent1" w:themeShade="BF"/>
-                                        <w:sz w:val="72"/>
-                                        <w:szCs w:val="72"/>
-                                        <w:lang w:val="it-IT"/>
-                                      </w:rPr>
-                                      <w:t xml:space="preserve">Schema </w:t>
-                                    </w:r>
-                                    <w:r>
-                                      <w:rPr>
-                                        <w:color w:val="0F4761" w:themeColor="accent1" w:themeShade="BF"/>
-                                        <w:sz w:val="72"/>
-                                        <w:szCs w:val="72"/>
-                                        <w:lang w:val="it-IT"/>
-                                      </w:rPr>
-                                      <w:t>a blocchi</w:t>
+                                      <w:t xml:space="preserve"> – Schema a blocchi</w:t>
                                     </w:r>
                                   </w:sdtContent>
                                 </w:sdt>
@@ -191,6 +174,7 @@
                                   <w:dataBinding w:prefixMappings="xmlns:ns0='http://purl.org/dc/elements/1.1/' xmlns:ns1='http://schemas.openxmlformats.org/package/2006/metadata/core-properties' " w:xpath="/ns1:coreProperties[1]/ns0:subject[1]" w:storeItemID="{6C3C8BC8-F283-45AE-878A-BAB7291924A1}"/>
                                   <w:text/>
                                 </w:sdtPr>
+                                <w:sdtEndPr/>
                                 <w:sdtContent>
                                   <w:p>
                                     <w:pPr>
@@ -233,6 +217,7 @@
                                   <w:dataBinding w:prefixMappings="xmlns:ns0='http://purl.org/dc/elements/1.1/' xmlns:ns1='http://schemas.openxmlformats.org/package/2006/metadata/core-properties' " w:xpath="/ns1:coreProperties[1]/ns0:creator[1]" w:storeItemID="{6C3C8BC8-F283-45AE-878A-BAB7291924A1}"/>
                                   <w:text/>
                                 </w:sdtPr>
+                                <w:sdtEndPr/>
                                 <w:sdtContent>
                                   <w:p>
                                     <w:pPr>
@@ -544,6 +529,7 @@
                                       <w:calendar w:val="gregorian"/>
                                     </w:date>
                                   </w:sdtPr>
+                                  <w:sdtEndPr/>
                                   <w:sdtContent>
                                     <w:r>
                                       <w:rPr>
@@ -665,6 +651,11 @@
     <w:sdt>
       <w:sdtPr>
         <w:rPr>
+          <w:rFonts w:asciiTheme="minorHAnsi" w:eastAsiaTheme="minorHAnsi" w:hAnsiTheme="minorHAnsi" w:cstheme="minorBidi"/>
+          <w:b w:val="0"/>
+          <w:color w:val="auto"/>
+          <w:sz w:val="24"/>
+          <w:szCs w:val="24"/>
           <w:lang w:val="it-IT"/>
         </w:rPr>
         <w:id w:val="-2113271988"/>
@@ -675,12 +666,8 @@
       </w:sdtPr>
       <w:sdtEndPr>
         <w:rPr>
-          <w:rFonts w:asciiTheme="minorHAnsi" w:eastAsiaTheme="minorHAnsi" w:hAnsiTheme="minorHAnsi" w:cstheme="minorBidi"/>
           <w:bCs/>
           <w:noProof/>
-          <w:color w:val="auto"/>
-          <w:sz w:val="24"/>
-          <w:szCs w:val="24"/>
           <w:lang w:val="en-US"/>
         </w:rPr>
       </w:sdtEndPr>
@@ -1662,7 +1649,7 @@
                     <pic:cNvPicPr/>
                   </pic:nvPicPr>
                   <pic:blipFill>
-                    <a:blip r:embed="rId7" cstate="print">
+                    <a:blip r:embed="rId9" cstate="print">
                       <a:extLst>
                         <a:ext uri="{28A0092B-C50C-407E-A947-70E740481C1C}">
                           <a14:useLocalDpi xmlns:a14="http://schemas.microsoft.com/office/drawing/2010/main" val="0"/>
@@ -3317,15 +3304,11 @@
     <w:p>
       <w:pPr>
         <w:pStyle w:val="FirstParagraph"/>
-        <w:rPr>
-          <w:lang w:val="it-IT"/>
-        </w:rPr>
       </w:pPr>
       <w:r>
         <w:rPr>
           <w:b/>
           <w:bCs/>
-          <w:lang w:val="it-IT"/>
         </w:rPr>
         <w:t>File di OUTPUT</w:t>
       </w:r>
@@ -3333,14 +3316,8 @@
     <w:p>
       <w:pPr>
         <w:pStyle w:val="FirstParagraph"/>
-        <w:rPr>
-          <w:lang w:val="it-IT"/>
-        </w:rPr>
-      </w:pPr>
-      <w:r>
-        <w:rPr>
-          <w:lang w:val="it-IT"/>
-        </w:rPr>
+      </w:pPr>
+      <w:r>
         <w:t>STRATEGIA_*.csv</w:t>
       </w:r>
     </w:p>
@@ -3403,29 +3380,19 @@
     <w:p>
       <w:pPr>
         <w:pStyle w:val="FirstParagraph"/>
-        <w:rPr>
-          <w:lang w:val="it-IT"/>
-        </w:rPr>
-      </w:pPr>
-      <w:r>
-        <w:rPr>
-          <w:lang w:val="it-IT"/>
-        </w:rPr>
+      </w:pPr>
+      <w:r>
         <w:t>RULES_STRATEGIA_*.csv</w:t>
       </w:r>
     </w:p>
     <w:p>
       <w:pPr>
         <w:pStyle w:val="FirstParagraph"/>
-        <w:rPr>
-          <w:lang w:val="it-IT"/>
-        </w:rPr>
       </w:pPr>
       <w:r>
         <w:rPr>
           <w:b/>
           <w:bCs/>
-          <w:lang w:val="it-IT"/>
         </w:rPr>
         <w:t>Tracciato:</w:t>
       </w:r>
@@ -3496,15 +3463,11 @@
     <w:p>
       <w:pPr>
         <w:pStyle w:val="FirstParagraph"/>
-        <w:rPr>
-          <w:lang w:val="it-IT"/>
-        </w:rPr>
       </w:pPr>
       <w:r>
         <w:rPr>
           <w:b/>
           <w:bCs/>
-          <w:lang w:val="it-IT"/>
         </w:rPr>
         <w:t>Tracciato</w:t>
       </w:r>
@@ -3512,7 +3475,6 @@
         <w:rPr>
           <w:b/>
           <w:bCs/>
-          <w:lang w:val="it-IT"/>
         </w:rPr>
         <w:t>:</w:t>
       </w:r>
@@ -3834,15 +3796,11 @@
     <w:p>
       <w:pPr>
         <w:pStyle w:val="FirstParagraph"/>
-        <w:rPr>
-          <w:lang w:val="it-IT"/>
-        </w:rPr>
       </w:pPr>
       <w:r>
         <w:rPr>
           <w:b/>
           <w:bCs/>
-          <w:lang w:val="it-IT"/>
         </w:rPr>
         <w:t>File di OUTPUT</w:t>
       </w:r>
@@ -3850,14 +3808,8 @@
     <w:p>
       <w:pPr>
         <w:pStyle w:val="FirstParagraph"/>
-        <w:rPr>
-          <w:lang w:val="it-IT"/>
-        </w:rPr>
-      </w:pPr>
-      <w:r>
-        <w:rPr>
-          <w:lang w:val="it-IT"/>
-        </w:rPr>
+      </w:pPr>
+      <w:r>
         <w:t>SIGNAL_*.csv</w:t>
       </w:r>
     </w:p>
@@ -4219,8 +4171,6 @@
           <w:lang w:val="it-IT"/>
         </w:rPr>
       </w:pPr>
-      <w:bookmarkStart w:id="11" w:name="_GoBack"/>
-      <w:bookmarkEnd w:id="11"/>
     </w:p>
     <w:p>
       <w:pPr>
@@ -4274,6 +4224,12 @@
       </w:r>
     </w:p>
     <w:sectPr>
+      <w:headerReference w:type="even" r:id="rId10"/>
+      <w:headerReference w:type="default" r:id="rId11"/>
+      <w:footerReference w:type="even" r:id="rId12"/>
+      <w:footerReference w:type="default" r:id="rId13"/>
+      <w:headerReference w:type="first" r:id="rId14"/>
+      <w:footerReference w:type="first" r:id="rId15"/>
       <w:footnotePr>
         <w:numRestart w:val="eachSect"/>
       </w:footnotePr>
@@ -4286,6 +4242,143 @@
     </w:sectPr>
   </w:body>
 </w:document>
+</file>
+
+<file path=word/endnotes.xml><?xml version="1.0" encoding="utf-8"?>
+<w:endnotes xmlns:wpc="http://schemas.microsoft.com/office/word/2010/wordprocessingCanvas" xmlns:cx="http://schemas.microsoft.com/office/drawing/2014/chartex" xmlns:cx1="http://schemas.microsoft.com/office/drawing/2015/9/8/chartex" xmlns:cx2="http://schemas.microsoft.com/office/drawing/2015/10/21/chartex" xmlns:cx3="http://schemas.microsoft.com/office/drawing/2016/5/9/chartex" xmlns:cx4="http://schemas.microsoft.com/office/drawing/2016/5/10/chartex" xmlns:cx5="http://schemas.microsoft.com/office/drawing/2016/5/11/chartex" xmlns:cx6="http://schemas.microsoft.com/office/drawing/2016/5/12/chartex" xmlns:cx7="http://schemas.microsoft.com/office/drawing/2016/5/13/chartex" xmlns:cx8="http://schemas.microsoft.com/office/drawing/2016/5/14/chartex" xmlns:mc="http://schemas.openxmlformats.org/markup-compatibility/2006" xmlns:aink="http://schemas.microsoft.com/office/drawing/2016/ink" xmlns:am3d="http://schemas.microsoft.com/office/drawing/2017/model3d" xmlns:o="urn:schemas-microsoft-com:office:office" xmlns:r="http://schemas.openxmlformats.org/officeDocument/2006/relationships" xmlns:m="http://schemas.openxmlformats.org/officeDocument/2006/math" xmlns:v="urn:schemas-microsoft-com:vml" xmlns:wp14="http://schemas.microsoft.com/office/word/2010/wordprocessingDrawing" xmlns:wp="http://schemas.openxmlformats.org/drawingml/2006/wordprocessingDrawing" xmlns:w10="urn:schemas-microsoft-com:office:word" xmlns:w="http://schemas.openxmlformats.org/wordprocessingml/2006/main" xmlns:w14="http://schemas.microsoft.com/office/word/2010/wordml" xmlns:w15="http://schemas.microsoft.com/office/word/2012/wordml" xmlns:w16cid="http://schemas.microsoft.com/office/word/2016/wordml/cid" xmlns:w16se="http://schemas.microsoft.com/office/word/2015/wordml/symex" xmlns:wpg="http://schemas.microsoft.com/office/word/2010/wordprocessingGroup" xmlns:wpi="http://schemas.microsoft.com/office/word/2010/wordprocessingInk" xmlns:wne="http://schemas.microsoft.com/office/word/2006/wordml" xmlns:wps="http://schemas.microsoft.com/office/word/2010/wordprocessingShape" mc:Ignorable="w14 w15 w16se w16cid wp14">
+  <w:endnote w:type="separator" w:id="-1">
+    <w:p>
+      <w:pPr>
+        <w:spacing w:after="0"/>
+      </w:pPr>
+      <w:r>
+        <w:separator/>
+      </w:r>
+    </w:p>
+  </w:endnote>
+  <w:endnote w:type="continuationSeparator" w:id="0">
+    <w:p>
+      <w:pPr>
+        <w:spacing w:after="0"/>
+      </w:pPr>
+      <w:r>
+        <w:continuationSeparator/>
+      </w:r>
+    </w:p>
+  </w:endnote>
+</w:endnotes>
+</file>
+
+<file path=word/footer1.xml><?xml version="1.0" encoding="utf-8"?>
+<w:ftr xmlns:wpc="http://schemas.microsoft.com/office/word/2010/wordprocessingCanvas" xmlns:cx="http://schemas.microsoft.com/office/drawing/2014/chartex" xmlns:cx1="http://schemas.microsoft.com/office/drawing/2015/9/8/chartex" xmlns:cx2="http://schemas.microsoft.com/office/drawing/2015/10/21/chartex" xmlns:cx3="http://schemas.microsoft.com/office/drawing/2016/5/9/chartex" xmlns:cx4="http://schemas.microsoft.com/office/drawing/2016/5/10/chartex" xmlns:cx5="http://schemas.microsoft.com/office/drawing/2016/5/11/chartex" xmlns:cx6="http://schemas.microsoft.com/office/drawing/2016/5/12/chartex" xmlns:cx7="http://schemas.microsoft.com/office/drawing/2016/5/13/chartex" xmlns:cx8="http://schemas.microsoft.com/office/drawing/2016/5/14/chartex" xmlns:mc="http://schemas.openxmlformats.org/markup-compatibility/2006" xmlns:aink="http://schemas.microsoft.com/office/drawing/2016/ink" xmlns:am3d="http://schemas.microsoft.com/office/drawing/2017/model3d" xmlns:o="urn:schemas-microsoft-com:office:office" xmlns:r="http://schemas.openxmlformats.org/officeDocument/2006/relationships" xmlns:m="http://schemas.openxmlformats.org/officeDocument/2006/math" xmlns:v="urn:schemas-microsoft-com:vml" xmlns:wp14="http://schemas.microsoft.com/office/word/2010/wordprocessingDrawing" xmlns:wp="http://schemas.openxmlformats.org/drawingml/2006/wordprocessingDrawing" xmlns:w10="urn:schemas-microsoft-com:office:word" xmlns:w="http://schemas.openxmlformats.org/wordprocessingml/2006/main" xmlns:w14="http://schemas.microsoft.com/office/word/2010/wordml" xmlns:w15="http://schemas.microsoft.com/office/word/2012/wordml" xmlns:w16cid="http://schemas.microsoft.com/office/word/2016/wordml/cid" xmlns:w16se="http://schemas.microsoft.com/office/word/2015/wordml/symex" xmlns:wpg="http://schemas.microsoft.com/office/word/2010/wordprocessingGroup" xmlns:wpi="http://schemas.microsoft.com/office/word/2010/wordprocessingInk" xmlns:wne="http://schemas.microsoft.com/office/word/2006/wordml" xmlns:wps="http://schemas.microsoft.com/office/word/2010/wordprocessingShape" mc:Ignorable="w14 w15 w16se w16cid wp14">
+  <w:p>
+    <w:pPr>
+      <w:pStyle w:val="Pidipagina"/>
+    </w:pPr>
+  </w:p>
+</w:ftr>
+</file>
+
+<file path=word/footer2.xml><?xml version="1.0" encoding="utf-8"?>
+<w:ftr xmlns:wpc="http://schemas.microsoft.com/office/word/2010/wordprocessingCanvas" xmlns:cx="http://schemas.microsoft.com/office/drawing/2014/chartex" xmlns:cx1="http://schemas.microsoft.com/office/drawing/2015/9/8/chartex" xmlns:cx2="http://schemas.microsoft.com/office/drawing/2015/10/21/chartex" xmlns:cx3="http://schemas.microsoft.com/office/drawing/2016/5/9/chartex" xmlns:cx4="http://schemas.microsoft.com/office/drawing/2016/5/10/chartex" xmlns:cx5="http://schemas.microsoft.com/office/drawing/2016/5/11/chartex" xmlns:cx6="http://schemas.microsoft.com/office/drawing/2016/5/12/chartex" xmlns:cx7="http://schemas.microsoft.com/office/drawing/2016/5/13/chartex" xmlns:cx8="http://schemas.microsoft.com/office/drawing/2016/5/14/chartex" xmlns:mc="http://schemas.openxmlformats.org/markup-compatibility/2006" xmlns:aink="http://schemas.microsoft.com/office/drawing/2016/ink" xmlns:am3d="http://schemas.microsoft.com/office/drawing/2017/model3d" xmlns:o="urn:schemas-microsoft-com:office:office" xmlns:r="http://schemas.openxmlformats.org/officeDocument/2006/relationships" xmlns:m="http://schemas.openxmlformats.org/officeDocument/2006/math" xmlns:v="urn:schemas-microsoft-com:vml" xmlns:wp14="http://schemas.microsoft.com/office/word/2010/wordprocessingDrawing" xmlns:wp="http://schemas.openxmlformats.org/drawingml/2006/wordprocessingDrawing" xmlns:w10="urn:schemas-microsoft-com:office:word" xmlns:w="http://schemas.openxmlformats.org/wordprocessingml/2006/main" xmlns:w14="http://schemas.microsoft.com/office/word/2010/wordml" xmlns:w15="http://schemas.microsoft.com/office/word/2012/wordml" xmlns:w16cid="http://schemas.microsoft.com/office/word/2016/wordml/cid" xmlns:w16se="http://schemas.microsoft.com/office/word/2015/wordml/symex" xmlns:wpg="http://schemas.microsoft.com/office/word/2010/wordprocessingGroup" xmlns:wpi="http://schemas.microsoft.com/office/word/2010/wordprocessingInk" xmlns:wne="http://schemas.microsoft.com/office/word/2006/wordml" xmlns:wps="http://schemas.microsoft.com/office/word/2010/wordprocessingShape" mc:Ignorable="w14 w15 w16se w16cid wp14">
+  <w:p>
+    <w:pPr>
+      <w:pStyle w:val="Pidipagina"/>
+    </w:pPr>
+  </w:p>
+</w:ftr>
+</file>
+
+<file path=word/footer3.xml><?xml version="1.0" encoding="utf-8"?>
+<w:ftr xmlns:wpc="http://schemas.microsoft.com/office/word/2010/wordprocessingCanvas" xmlns:cx="http://schemas.microsoft.com/office/drawing/2014/chartex" xmlns:cx1="http://schemas.microsoft.com/office/drawing/2015/9/8/chartex" xmlns:cx2="http://schemas.microsoft.com/office/drawing/2015/10/21/chartex" xmlns:cx3="http://schemas.microsoft.com/office/drawing/2016/5/9/chartex" xmlns:cx4="http://schemas.microsoft.com/office/drawing/2016/5/10/chartex" xmlns:cx5="http://schemas.microsoft.com/office/drawing/2016/5/11/chartex" xmlns:cx6="http://schemas.microsoft.com/office/drawing/2016/5/12/chartex" xmlns:cx7="http://schemas.microsoft.com/office/drawing/2016/5/13/chartex" xmlns:cx8="http://schemas.microsoft.com/office/drawing/2016/5/14/chartex" xmlns:mc="http://schemas.openxmlformats.org/markup-compatibility/2006" xmlns:aink="http://schemas.microsoft.com/office/drawing/2016/ink" xmlns:am3d="http://schemas.microsoft.com/office/drawing/2017/model3d" xmlns:o="urn:schemas-microsoft-com:office:office" xmlns:r="http://schemas.openxmlformats.org/officeDocument/2006/relationships" xmlns:m="http://schemas.openxmlformats.org/officeDocument/2006/math" xmlns:v="urn:schemas-microsoft-com:vml" xmlns:wp14="http://schemas.microsoft.com/office/word/2010/wordprocessingDrawing" xmlns:wp="http://schemas.openxmlformats.org/drawingml/2006/wordprocessingDrawing" xmlns:w10="urn:schemas-microsoft-com:office:word" xmlns:w="http://schemas.openxmlformats.org/wordprocessingml/2006/main" xmlns:w14="http://schemas.microsoft.com/office/word/2010/wordml" xmlns:w15="http://schemas.microsoft.com/office/word/2012/wordml" xmlns:w16cid="http://schemas.microsoft.com/office/word/2016/wordml/cid" xmlns:w16se="http://schemas.microsoft.com/office/word/2015/wordml/symex" xmlns:wpg="http://schemas.microsoft.com/office/word/2010/wordprocessingGroup" xmlns:wpi="http://schemas.microsoft.com/office/word/2010/wordprocessingInk" xmlns:wne="http://schemas.microsoft.com/office/word/2006/wordml" xmlns:wps="http://schemas.microsoft.com/office/word/2010/wordprocessingShape" mc:Ignorable="w14 w15 w16se w16cid wp14">
+  <w:p>
+    <w:pPr>
+      <w:pStyle w:val="Pidipagina"/>
+    </w:pPr>
+  </w:p>
+</w:ftr>
+</file>
+
+<file path=word/footnotes.xml><?xml version="1.0" encoding="utf-8"?>
+<w:footnotes xmlns:wpc="http://schemas.microsoft.com/office/word/2010/wordprocessingCanvas" xmlns:cx="http://schemas.microsoft.com/office/drawing/2014/chartex" xmlns:cx1="http://schemas.microsoft.com/office/drawing/2015/9/8/chartex" xmlns:cx2="http://schemas.microsoft.com/office/drawing/2015/10/21/chartex" xmlns:cx3="http://schemas.microsoft.com/office/drawing/2016/5/9/chartex" xmlns:cx4="http://schemas.microsoft.com/office/drawing/2016/5/10/chartex" xmlns:cx5="http://schemas.microsoft.com/office/drawing/2016/5/11/chartex" xmlns:cx6="http://schemas.microsoft.com/office/drawing/2016/5/12/chartex" xmlns:cx7="http://schemas.microsoft.com/office/drawing/2016/5/13/chartex" xmlns:cx8="http://schemas.microsoft.com/office/drawing/2016/5/14/chartex" xmlns:mc="http://schemas.openxmlformats.org/markup-compatibility/2006" xmlns:aink="http://schemas.microsoft.com/office/drawing/2016/ink" xmlns:am3d="http://schemas.microsoft.com/office/drawing/2017/model3d" xmlns:o="urn:schemas-microsoft-com:office:office" xmlns:r="http://schemas.openxmlformats.org/officeDocument/2006/relationships" xmlns:m="http://schemas.openxmlformats.org/officeDocument/2006/math" xmlns:v="urn:schemas-microsoft-com:vml" xmlns:wp14="http://schemas.microsoft.com/office/word/2010/wordprocessingDrawing" xmlns:wp="http://schemas.openxmlformats.org/drawingml/2006/wordprocessingDrawing" xmlns:w10="urn:schemas-microsoft-com:office:word" xmlns:w="http://schemas.openxmlformats.org/wordprocessingml/2006/main" xmlns:w14="http://schemas.microsoft.com/office/word/2010/wordml" xmlns:w15="http://schemas.microsoft.com/office/word/2012/wordml" xmlns:w16cid="http://schemas.microsoft.com/office/word/2016/wordml/cid" xmlns:w16se="http://schemas.microsoft.com/office/word/2015/wordml/symex" xmlns:wpg="http://schemas.microsoft.com/office/word/2010/wordprocessingGroup" xmlns:wpi="http://schemas.microsoft.com/office/word/2010/wordprocessingInk" xmlns:wne="http://schemas.microsoft.com/office/word/2006/wordml" xmlns:wps="http://schemas.microsoft.com/office/word/2010/wordprocessingShape" mc:Ignorable="w14 w15 w16se w16cid wp14">
+  <w:footnote w:type="separator" w:id="-1">
+    <w:p>
+      <w:pPr>
+        <w:spacing w:after="0"/>
+      </w:pPr>
+      <w:r>
+        <w:separator/>
+      </w:r>
+    </w:p>
+  </w:footnote>
+  <w:footnote w:type="continuationSeparator" w:id="0">
+    <w:p>
+      <w:pPr>
+        <w:spacing w:after="0"/>
+      </w:pPr>
+      <w:r>
+        <w:continuationSeparator/>
+      </w:r>
+    </w:p>
+  </w:footnote>
+</w:footnotes>
+</file>
+
+<file path=word/header1.xml><?xml version="1.0" encoding="utf-8"?>
+<w:hdr xmlns:wpc="http://schemas.microsoft.com/office/word/2010/wordprocessingCanvas" xmlns:cx="http://schemas.microsoft.com/office/drawing/2014/chartex" xmlns:cx1="http://schemas.microsoft.com/office/drawing/2015/9/8/chartex" xmlns:cx2="http://schemas.microsoft.com/office/drawing/2015/10/21/chartex" xmlns:cx3="http://schemas.microsoft.com/office/drawing/2016/5/9/chartex" xmlns:cx4="http://schemas.microsoft.com/office/drawing/2016/5/10/chartex" xmlns:cx5="http://schemas.microsoft.com/office/drawing/2016/5/11/chartex" xmlns:cx6="http://schemas.microsoft.com/office/drawing/2016/5/12/chartex" xmlns:cx7="http://schemas.microsoft.com/office/drawing/2016/5/13/chartex" xmlns:cx8="http://schemas.microsoft.com/office/drawing/2016/5/14/chartex" xmlns:mc="http://schemas.openxmlformats.org/markup-compatibility/2006" xmlns:aink="http://schemas.microsoft.com/office/drawing/2016/ink" xmlns:am3d="http://schemas.microsoft.com/office/drawing/2017/model3d" xmlns:o="urn:schemas-microsoft-com:office:office" xmlns:r="http://schemas.openxmlformats.org/officeDocument/2006/relationships" xmlns:m="http://schemas.openxmlformats.org/officeDocument/2006/math" xmlns:v="urn:schemas-microsoft-com:vml" xmlns:wp14="http://schemas.microsoft.com/office/word/2010/wordprocessingDrawing" xmlns:wp="http://schemas.openxmlformats.org/drawingml/2006/wordprocessingDrawing" xmlns:w10="urn:schemas-microsoft-com:office:word" xmlns:w="http://schemas.openxmlformats.org/wordprocessingml/2006/main" xmlns:w14="http://schemas.microsoft.com/office/word/2010/wordml" xmlns:w15="http://schemas.microsoft.com/office/word/2012/wordml" xmlns:w16cid="http://schemas.microsoft.com/office/word/2016/wordml/cid" xmlns:w16se="http://schemas.microsoft.com/office/word/2015/wordml/symex" xmlns:wpg="http://schemas.microsoft.com/office/word/2010/wordprocessingGroup" xmlns:wpi="http://schemas.microsoft.com/office/word/2010/wordprocessingInk" xmlns:wne="http://schemas.microsoft.com/office/word/2006/wordml" xmlns:wps="http://schemas.microsoft.com/office/word/2010/wordprocessingShape" mc:Ignorable="w14 w15 w16se w16cid wp14">
+  <w:p>
+    <w:pPr>
+      <w:pStyle w:val="Intestazione"/>
+    </w:pPr>
+  </w:p>
+</w:hdr>
+</file>
+
+<file path=word/header2.xml><?xml version="1.0" encoding="utf-8"?>
+<w:hdr xmlns:wpc="http://schemas.microsoft.com/office/word/2010/wordprocessingCanvas" xmlns:cx="http://schemas.microsoft.com/office/drawing/2014/chartex" xmlns:cx1="http://schemas.microsoft.com/office/drawing/2015/9/8/chartex" xmlns:cx2="http://schemas.microsoft.com/office/drawing/2015/10/21/chartex" xmlns:cx3="http://schemas.microsoft.com/office/drawing/2016/5/9/chartex" xmlns:cx4="http://schemas.microsoft.com/office/drawing/2016/5/10/chartex" xmlns:cx5="http://schemas.microsoft.com/office/drawing/2016/5/11/chartex" xmlns:cx6="http://schemas.microsoft.com/office/drawing/2016/5/12/chartex" xmlns:cx7="http://schemas.microsoft.com/office/drawing/2016/5/13/chartex" xmlns:cx8="http://schemas.microsoft.com/office/drawing/2016/5/14/chartex" xmlns:mc="http://schemas.openxmlformats.org/markup-compatibility/2006" xmlns:aink="http://schemas.microsoft.com/office/drawing/2016/ink" xmlns:am3d="http://schemas.microsoft.com/office/drawing/2017/model3d" xmlns:o="urn:schemas-microsoft-com:office:office" xmlns:r="http://schemas.openxmlformats.org/officeDocument/2006/relationships" xmlns:m="http://schemas.openxmlformats.org/officeDocument/2006/math" xmlns:v="urn:schemas-microsoft-com:vml" xmlns:wp14="http://schemas.microsoft.com/office/word/2010/wordprocessingDrawing" xmlns:wp="http://schemas.openxmlformats.org/drawingml/2006/wordprocessingDrawing" xmlns:w10="urn:schemas-microsoft-com:office:word" xmlns:w="http://schemas.openxmlformats.org/wordprocessingml/2006/main" xmlns:w14="http://schemas.microsoft.com/office/word/2010/wordml" xmlns:w15="http://schemas.microsoft.com/office/word/2012/wordml" xmlns:w16cid="http://schemas.microsoft.com/office/word/2016/wordml/cid" xmlns:w16se="http://schemas.microsoft.com/office/word/2015/wordml/symex" xmlns:wpg="http://schemas.microsoft.com/office/word/2010/wordprocessingGroup" xmlns:wpi="http://schemas.microsoft.com/office/word/2010/wordprocessingInk" xmlns:wne="http://schemas.microsoft.com/office/word/2006/wordml" xmlns:wps="http://schemas.microsoft.com/office/word/2010/wordprocessingShape" mc:Ignorable="w14 w15 w16se w16cid wp14">
+  <w:p>
+    <w:pPr>
+      <w:pStyle w:val="Intestazione"/>
+    </w:pPr>
+  </w:p>
+</w:hdr>
+</file>
+
+<file path=word/header3.xml><?xml version="1.0" encoding="utf-8"?>
+<w:hdr xmlns:wpc="http://schemas.microsoft.com/office/word/2010/wordprocessingCanvas" xmlns:cx="http://schemas.microsoft.com/office/drawing/2014/chartex" xmlns:cx1="http://schemas.microsoft.com/office/drawing/2015/9/8/chartex" xmlns:cx2="http://schemas.microsoft.com/office/drawing/2015/10/21/chartex" xmlns:cx3="http://schemas.microsoft.com/office/drawing/2016/5/9/chartex" xmlns:cx4="http://schemas.microsoft.com/office/drawing/2016/5/10/chartex" xmlns:cx5="http://schemas.microsoft.com/office/drawing/2016/5/11/chartex" xmlns:cx6="http://schemas.microsoft.com/office/drawing/2016/5/12/chartex" xmlns:cx7="http://schemas.microsoft.com/office/drawing/2016/5/13/chartex" xmlns:cx8="http://schemas.microsoft.com/office/drawing/2016/5/14/chartex" xmlns:mc="http://schemas.openxmlformats.org/markup-compatibility/2006" xmlns:aink="http://schemas.microsoft.com/office/drawing/2016/ink" xmlns:am3d="http://schemas.microsoft.com/office/drawing/2017/model3d" xmlns:o="urn:schemas-microsoft-com:office:office" xmlns:r="http://schemas.openxmlformats.org/officeDocument/2006/relationships" xmlns:m="http://schemas.openxmlformats.org/officeDocument/2006/math" xmlns:v="urn:schemas-microsoft-com:vml" xmlns:wp14="http://schemas.microsoft.com/office/word/2010/wordprocessingDrawing" xmlns:wp="http://schemas.openxmlformats.org/drawingml/2006/wordprocessingDrawing" xmlns:w10="urn:schemas-microsoft-com:office:word" xmlns:w="http://schemas.openxmlformats.org/wordprocessingml/2006/main" xmlns:w14="http://schemas.microsoft.com/office/word/2010/wordml" xmlns:w15="http://schemas.microsoft.com/office/word/2012/wordml" xmlns:w16cid="http://schemas.microsoft.com/office/word/2016/wordml/cid" xmlns:w16se="http://schemas.microsoft.com/office/word/2015/wordml/symex" xmlns:wpg="http://schemas.microsoft.com/office/word/2010/wordprocessingGroup" xmlns:wpi="http://schemas.microsoft.com/office/word/2010/wordprocessingInk" xmlns:wne="http://schemas.microsoft.com/office/word/2006/wordml" xmlns:wps="http://schemas.microsoft.com/office/word/2010/wordprocessingShape" mc:Ignorable="w14 w15 w16se w16cid wp14">
+  <w:p>
+    <w:pPr>
+      <w:pStyle w:val="Intestazione"/>
+      <w:rPr>
+        <w:lang w:val="it-IT"/>
+      </w:rPr>
+    </w:pPr>
+    <w:r>
+      <w:fldChar w:fldCharType="begin"/>
+    </w:r>
+    <w:r>
+      <w:rPr>
+        <w:lang w:val="it-IT"/>
+      </w:rPr>
+      <w:instrText xml:space="preserve"> FILENAME  \* MERGEFORMAT </w:instrText>
+    </w:r>
+    <w:r>
+      <w:fldChar w:fldCharType="separate"/>
+    </w:r>
+    <w:r>
+      <w:rPr>
+        <w:noProof/>
+        <w:lang w:val="it-IT"/>
+      </w:rPr>
+      <w:t>Documentazione Sintetica Moduli – Py Suite Trading-3.docx</w:t>
+    </w:r>
+    <w:r>
+      <w:fldChar w:fldCharType="end"/>
+    </w:r>
+    <w:bookmarkStart w:id="11" w:name="_GoBack"/>
+    <w:bookmarkEnd w:id="11"/>
+  </w:p>
+</w:hdr>
 </file>
 
 <file path=word/numbering.xml><?xml version="1.0" encoding="utf-8"?>
@@ -5703,6 +5796,13 @@
     <w:lsdException w:name="Light Shading"/>
     <w:lsdException w:name="Light List"/>
     <w:lsdException w:name="Light Grid"/>
+    <w:lsdException w:name="Medium Shading 1"/>
+    <w:lsdException w:name="Medium Shading 2"/>
+    <w:lsdException w:name="Medium List 1"/>
+    <w:lsdException w:name="Medium List 2"/>
+    <w:lsdException w:name="Medium Grid 1"/>
+    <w:lsdException w:name="Medium Grid 2"/>
+    <w:lsdException w:name="Medium Grid 3"/>
     <w:lsdException w:name="Dark List"/>
     <w:lsdException w:name="Colorful Shading"/>
     <w:lsdException w:name="Colorful List"/>
@@ -6101,6 +6201,7 @@
   <w:style w:type="character" w:default="1" w:styleId="Carpredefinitoparagrafo">
     <w:name w:val="Default Paragraph Font"/>
     <w:uiPriority w:val="1"/>
+    <w:semiHidden/>
     <w:unhideWhenUsed/>
   </w:style>
   <w:style w:type="table" w:default="1" w:styleId="Tabellanormale">
@@ -7029,6 +7130,46 @@
       <w:szCs w:val="22"/>
       <w:lang w:eastAsia="zh-CN"/>
     </w:rPr>
+  </w:style>
+  <w:style w:type="paragraph" w:styleId="Intestazione">
+    <w:name w:val="header"/>
+    <w:basedOn w:val="Normale"/>
+    <w:link w:val="IntestazioneCarattere"/>
+    <w:unhideWhenUsed/>
+    <w:rsid w:val="00CD1025"/>
+    <w:pPr>
+      <w:tabs>
+        <w:tab w:val="center" w:pos="4819"/>
+        <w:tab w:val="right" w:pos="9638"/>
+      </w:tabs>
+      <w:spacing w:after="0"/>
+    </w:pPr>
+  </w:style>
+  <w:style w:type="character" w:customStyle="1" w:styleId="IntestazioneCarattere">
+    <w:name w:val="Intestazione Carattere"/>
+    <w:basedOn w:val="Carpredefinitoparagrafo"/>
+    <w:link w:val="Intestazione"/>
+    <w:rsid w:val="00CD1025"/>
+  </w:style>
+  <w:style w:type="paragraph" w:styleId="Pidipagina">
+    <w:name w:val="footer"/>
+    <w:basedOn w:val="Normale"/>
+    <w:link w:val="PidipaginaCarattere"/>
+    <w:unhideWhenUsed/>
+    <w:rsid w:val="00CD1025"/>
+    <w:pPr>
+      <w:tabs>
+        <w:tab w:val="center" w:pos="4819"/>
+        <w:tab w:val="right" w:pos="9638"/>
+      </w:tabs>
+      <w:spacing w:after="0"/>
+    </w:pPr>
+  </w:style>
+  <w:style w:type="character" w:customStyle="1" w:styleId="PidipaginaCarattere">
+    <w:name w:val="Piè di pagina Carattere"/>
+    <w:basedOn w:val="Carpredefinitoparagrafo"/>
+    <w:link w:val="Pidipagina"/>
+    <w:rsid w:val="00CD1025"/>
   </w:style>
 </w:styles>
 </file>
@@ -7352,7 +7493,7 @@
 </file>
 
 <file path=customXml/itemProps2.xml><?xml version="1.0" encoding="utf-8"?>
-<ds:datastoreItem xmlns:ds="http://schemas.openxmlformats.org/officeDocument/2006/customXml" ds:itemID="{AB75A5C2-F054-6146-B27A-7DC6662341BC}">
+<ds:datastoreItem xmlns:ds="http://schemas.openxmlformats.org/officeDocument/2006/customXml" ds:itemID="{057C9D87-6EE0-D14C-BBAA-12B7C903D86C}">
   <ds:schemaRefs>
     <ds:schemaRef ds:uri="http://schemas.openxmlformats.org/officeDocument/2006/bibliography"/>
   </ds:schemaRefs>

</xml_diff>